<commit_message>
Add author name to the title page
Added "Prepared by Nnaemeka Chukwuma" to the dossier's title page in
both formats (PDF and DOCX). Along the way, found and fixed a real
xhtml2pdf bug: adding the author as a separate <p> sibling after the
existing "TeSA Africa" line caused that line to be silently dropped
from the rendered PDF (visible only by extracting the page's raw
text, not by looking at it) -- fixed by merging both lines into one
paragraph with a <br/>. Re-verified the full build: OpenAPI still
validates, page counts correct (50-page dossier, 1-page summary),
title page text extracted and confirmed complete in both formats.

Co-Authored-By: Claude Sonnet 5 <noreply@anthropic.com>
</commit_message>
<xml_diff>
--- a/submission/Takarda-Decision-Dossier.docx
+++ b/submission/Takarda-Decision-Dossier.docx
@@ -21,6 +21,14 @@
       </w:pPr>
       <w:r>
         <w:t>Architecture and decision record for the Takarda results-checking platform, prepared for the National Secondary Certificate Council contract.</w:t>
+      </w:r>
+    </w:p>
+    <w:p>
+      <w:pPr>
+        <w:jc w:val="center"/>
+      </w:pPr>
+      <w:r>
+        <w:t>Prepared by Nnaemeka Chukwuma</w:t>
       </w:r>
     </w:p>
     <w:p>

</xml_diff>